<commit_message>
adiciona campos de formato e link
</commit_message>
<xml_diff>
--- a/Templates/doc_banca.docx
+++ b/Templates/doc_banca.docx
@@ -1,6 +1,6 @@
 
 <file path=word/document.xml><?xml version="1.0" encoding="utf-8"?>
-<w:document xmlns:o="urn:schemas-microsoft-com:office:office" xmlns:r="http://schemas.openxmlformats.org/officeDocument/2006/relationships" xmlns:v="urn:schemas-microsoft-com:vml" xmlns:w="http://schemas.openxmlformats.org/wordprocessingml/2006/main" xmlns:w10="urn:schemas-microsoft-com:office:word" xmlns:wp="http://schemas.openxmlformats.org/drawingml/2006/wordprocessingDrawing" xmlns:wps="http://schemas.microsoft.com/office/word/2010/wordprocessingShape" xmlns:wpg="http://schemas.microsoft.com/office/word/2010/wordprocessingGroup" xmlns:mc="http://schemas.openxmlformats.org/markup-compatibility/2006" xmlns:wp14="http://schemas.microsoft.com/office/word/2010/wordprocessingDrawing" xmlns:w14="http://schemas.microsoft.com/office/word/2010/wordml" xmlns:w15="http://schemas.microsoft.com/office/word/2012/wordml" mc:Ignorable="w14 wp14 w15">
+<w:document xmlns:o="urn:schemas-microsoft-com:office:office" xmlns:r="http://schemas.openxmlformats.org/officeDocument/2006/relationships" xmlns:v="urn:schemas-microsoft-com:vml" xmlns:w="http://schemas.openxmlformats.org/wordprocessingml/2006/main" xmlns:w10="urn:schemas-microsoft-com:office:word" xmlns:wp="http://schemas.openxmlformats.org/drawingml/2006/wordprocessingDrawing" xmlns:pic="http://schemas.openxmlformats.org/drawingml/2006/picture" xmlns:wps="http://schemas.microsoft.com/office/word/2010/wordprocessingShape" xmlns:wpg="http://schemas.microsoft.com/office/word/2010/wordprocessingGroup" xmlns:mc="http://schemas.openxmlformats.org/markup-compatibility/2006" xmlns:wp14="http://schemas.microsoft.com/office/word/2010/wordprocessingDrawing" xmlns:w14="http://schemas.microsoft.com/office/word/2010/wordml" xmlns:w15="http://schemas.microsoft.com/office/word/2012/wordml" mc:Ignorable="w14 wp14 w15">
   <w:body>
     <w:p>
       <w:pPr>
@@ -51,7 +51,7 @@
         <w:rPr>
           <w:lang w:val="pt-PT" w:eastAsia="zh-CN" w:bidi="hi-IN"/>
         </w:rPr>
-        <w:t>", realizada no dia {{data_hora}}, em {{local_defesa}}:</w:t>
+        <w:t>", realizada no dia {{data_hora}} **{% if formato_remoto %}em formato remoto, {% else %}em formato presencial, {% endif %}**em {{local_defesa}}:</w:t>
       </w:r>
     </w:p>
     <w:p>
@@ -239,7 +239,7 @@
     </w:rPr>
   </w:style>
   <w:style w:type="paragraph" w:styleId="Caption">
-    <w:name w:val="Caption"/>
+    <w:name w:val="caption"/>
     <w:basedOn w:val="Normal"/>
     <w:qFormat/>
     <w:pPr>
@@ -276,37 +276,37 @@
         <a:srgbClr val="000000"/>
       </a:dk1>
       <a:lt1>
-        <a:srgbClr val="ffffff"/>
+        <a:srgbClr val="FFFFFF"/>
       </a:lt1>
       <a:dk2>
         <a:srgbClr val="000000"/>
       </a:dk2>
       <a:lt2>
-        <a:srgbClr val="ffffff"/>
+        <a:srgbClr val="FFFFFF"/>
       </a:lt2>
       <a:accent1>
-        <a:srgbClr val="18a303"/>
+        <a:srgbClr val="18A303"/>
       </a:accent1>
       <a:accent2>
-        <a:srgbClr val="0369a3"/>
+        <a:srgbClr val="0369A3"/>
       </a:accent2>
       <a:accent3>
-        <a:srgbClr val="a33e03"/>
+        <a:srgbClr val="A33E03"/>
       </a:accent3>
       <a:accent4>
-        <a:srgbClr val="8e03a3"/>
+        <a:srgbClr val="8E03A3"/>
       </a:accent4>
       <a:accent5>
-        <a:srgbClr val="c99c00"/>
+        <a:srgbClr val="C99C00"/>
       </a:accent5>
       <a:accent6>
-        <a:srgbClr val="c9211e"/>
+        <a:srgbClr val="C9211E"/>
       </a:accent6>
       <a:hlink>
-        <a:srgbClr val="0000ee"/>
+        <a:srgbClr val="0000EE"/>
       </a:hlink>
       <a:folHlink>
-        <a:srgbClr val="551a8b"/>
+        <a:srgbClr val="551A8B"/>
       </a:folHlink>
     </a:clrScheme>
     <a:fontScheme name="Office">

</xml_diff>

<commit_message>
correções de rotas dos arquivos e formatação
</commit_message>
<xml_diff>
--- a/Templates/doc_banca.docx
+++ b/Templates/doc_banca.docx
@@ -1,6 +1,6 @@
 
 <file path=word/document.xml><?xml version="1.0" encoding="utf-8"?>
-<w:document xmlns:o="urn:schemas-microsoft-com:office:office" xmlns:r="http://schemas.openxmlformats.org/officeDocument/2006/relationships" xmlns:v="urn:schemas-microsoft-com:vml" xmlns:w="http://schemas.openxmlformats.org/wordprocessingml/2006/main" xmlns:w10="urn:schemas-microsoft-com:office:word" xmlns:wp="http://schemas.openxmlformats.org/drawingml/2006/wordprocessingDrawing" xmlns:pic="http://schemas.openxmlformats.org/drawingml/2006/picture" xmlns:wps="http://schemas.microsoft.com/office/word/2010/wordprocessingShape" xmlns:wpg="http://schemas.microsoft.com/office/word/2010/wordprocessingGroup" xmlns:mc="http://schemas.openxmlformats.org/markup-compatibility/2006" xmlns:wp14="http://schemas.microsoft.com/office/word/2010/wordprocessingDrawing" xmlns:w14="http://schemas.microsoft.com/office/word/2010/wordml" xmlns:w15="http://schemas.microsoft.com/office/word/2012/wordml" mc:Ignorable="w14 wp14 w15">
+<w:document xmlns:o="urn:schemas-microsoft-com:office:office" xmlns:r="http://schemas.openxmlformats.org/officeDocument/2006/relationships" xmlns:v="urn:schemas-microsoft-com:vml" xmlns:w="http://schemas.openxmlformats.org/wordprocessingml/2006/main" xmlns:w10="urn:schemas-microsoft-com:office:word" xmlns:wp="http://schemas.openxmlformats.org/drawingml/2006/wordprocessingDrawing" xmlns:wps="http://schemas.microsoft.com/office/word/2010/wordprocessingShape" xmlns:wpg="http://schemas.microsoft.com/office/word/2010/wordprocessingGroup" xmlns:mc="http://schemas.openxmlformats.org/markup-compatibility/2006" xmlns:wp14="http://schemas.microsoft.com/office/word/2010/wordprocessingDrawing" xmlns:w14="http://schemas.microsoft.com/office/word/2010/wordml" xmlns:w15="http://schemas.microsoft.com/office/word/2012/wordml" mc:Ignorable="w14 wp14 w15">
   <w:body>
     <w:p>
       <w:pPr>
@@ -27,17 +27,9 @@
       </w:r>
       <w:r>
         <w:rPr>
-          <w:b w:val="false"/>
-          <w:bCs w:val="false"/>
-          <w:lang w:val="pt-PT" w:eastAsia="zh-CN" w:bidi="hi-IN"/>
-        </w:rPr>
-        <w:t>,</w:t>
-      </w:r>
-      <w:r>
-        <w:rPr>
-          <w:lang w:val="pt-PT" w:eastAsia="zh-CN" w:bidi="hi-IN"/>
-        </w:rPr>
-        <w:t xml:space="preserve"> intitulada “</w:t>
+          <w:lang w:val="pt-PT" w:eastAsia="zh-CN" w:bidi="hi-IN"/>
+        </w:rPr>
+        <w:t>, intitulada “</w:t>
       </w:r>
       <w:r>
         <w:rPr>
@@ -51,7 +43,7 @@
         <w:rPr>
           <w:lang w:val="pt-PT" w:eastAsia="zh-CN" w:bidi="hi-IN"/>
         </w:rPr>
-        <w:t>", realizada no dia {{data_hora}} **{% if formato_remoto %}em formato remoto, {% else %}em formato presencial, {% endif %}**em {{local_defesa}}:</w:t>
+        <w:t>", realizada no dia {{data_hora}}, {% if formato_remoto %}em formato remoto{% else %}em formato presencial, em {{local_defesa}}{% endif %}:</w:t>
       </w:r>
     </w:p>
     <w:p>
@@ -132,7 +124,7 @@
         <w:rPr>
           <w:lang w:val="pt-PT" w:eastAsia="zh-CN" w:bidi="hi-IN"/>
         </w:rPr>
-        <w:t>{{examinadores_externos}} (Examinador(es) Externo(s))</w:t>
+        <w:t>{{examinadores_internos}} (Membro(s) Interno(s))</w:t>
       </w:r>
     </w:p>
     <w:p>
@@ -154,7 +146,111 @@
         <w:rPr>
           <w:lang w:val="pt-PT" w:eastAsia="zh-CN" w:bidi="hi-IN"/>
         </w:rPr>
-        <w:t>{{examinadores_internos}} (Examinador(es) Interno(s))</w:t>
+        <w:t>{{examinadores_externos}} (Membro(s) Externo(s))</w:t>
+      </w:r>
+    </w:p>
+    <w:p>
+      <w:pPr>
+        <w:pStyle w:val="Normal"/>
+        <w:bidi w:val="0"/>
+        <w:jc w:val="left"/>
+        <w:rPr>
+          <w:lang w:val="pt-PT" w:eastAsia="zh-CN" w:bidi="hi-IN"/>
+        </w:rPr>
+      </w:pPr>
+      <w:r>
+        <w:rPr>
+          <w:lang w:val="pt-PT" w:eastAsia="zh-CN" w:bidi="hi-IN"/>
+        </w:rPr>
+      </w:r>
+    </w:p>
+    <w:p>
+      <w:pPr>
+        <w:pStyle w:val="Normal"/>
+        <w:bidi w:val="0"/>
+        <w:jc w:val="left"/>
+        <w:rPr>
+          <w:lang w:val="pt-PT" w:eastAsia="zh-CN" w:bidi="hi-IN"/>
+        </w:rPr>
+      </w:pPr>
+      <w:r>
+        <w:rPr>
+          <w:lang w:val="pt-PT" w:eastAsia="zh-CN" w:bidi="hi-IN"/>
+        </w:rPr>
+      </w:r>
+    </w:p>
+    <w:p>
+      <w:pPr>
+        <w:pStyle w:val="Normal"/>
+        <w:bidi w:val="0"/>
+        <w:jc w:val="left"/>
+        <w:rPr>
+          <w:lang w:val="pt-PT" w:eastAsia="zh-CN" w:bidi="hi-IN"/>
+        </w:rPr>
+      </w:pPr>
+      <w:r>
+        <w:rPr>
+          <w:lang w:val="pt-PT" w:eastAsia="zh-CN" w:bidi="hi-IN"/>
+        </w:rPr>
+      </w:r>
+    </w:p>
+    <w:p>
+      <w:pPr>
+        <w:pStyle w:val="Normal"/>
+        <w:bidi w:val="0"/>
+        <w:jc w:val="center"/>
+        <w:rPr/>
+      </w:pPr>
+      <w:r>
+        <w:rPr>
+          <w:lang w:val="pt-PT" w:eastAsia="zh-CN" w:bidi="hi-IN"/>
+        </w:rPr>
+        <w:t>Recife, {{data}}.</w:t>
+      </w:r>
+    </w:p>
+    <w:p>
+      <w:pPr>
+        <w:pStyle w:val="Normal"/>
+        <w:bidi w:val="0"/>
+        <w:jc w:val="left"/>
+        <w:rPr>
+          <w:lang w:val="pt-PT" w:eastAsia="zh-CN" w:bidi="hi-IN"/>
+        </w:rPr>
+      </w:pPr>
+      <w:r>
+        <w:rPr>
+          <w:lang w:val="pt-PT" w:eastAsia="zh-CN" w:bidi="hi-IN"/>
+        </w:rPr>
+      </w:r>
+    </w:p>
+    <w:p>
+      <w:pPr>
+        <w:pStyle w:val="Normal"/>
+        <w:bidi w:val="0"/>
+        <w:jc w:val="left"/>
+        <w:rPr>
+          <w:lang w:val="pt-PT" w:eastAsia="zh-CN" w:bidi="hi-IN"/>
+        </w:rPr>
+      </w:pPr>
+      <w:r>
+        <w:rPr>
+          <w:lang w:val="pt-PT" w:eastAsia="zh-CN" w:bidi="hi-IN"/>
+        </w:rPr>
+      </w:r>
+    </w:p>
+    <w:p>
+      <w:pPr>
+        <w:pStyle w:val="Normal"/>
+        <w:bidi w:val="0"/>
+        <w:jc w:val="left"/>
+        <w:rPr>
+          <w:lang w:val="pt-PT" w:eastAsia="zh-CN" w:bidi="hi-IN"/>
+        </w:rPr>
+      </w:pPr>
+      <w:r>
+        <w:rPr>
+          <w:lang w:val="pt-PT" w:eastAsia="zh-CN" w:bidi="hi-IN"/>
+        </w:rPr>
       </w:r>
     </w:p>
     <w:sectPr>
@@ -239,7 +335,7 @@
     </w:rPr>
   </w:style>
   <w:style w:type="paragraph" w:styleId="Caption">
-    <w:name w:val="caption"/>
+    <w:name w:val="Caption"/>
     <w:basedOn w:val="Normal"/>
     <w:qFormat/>
     <w:pPr>
@@ -276,37 +372,37 @@
         <a:srgbClr val="000000"/>
       </a:dk1>
       <a:lt1>
-        <a:srgbClr val="FFFFFF"/>
+        <a:srgbClr val="ffffff"/>
       </a:lt1>
       <a:dk2>
         <a:srgbClr val="000000"/>
       </a:dk2>
       <a:lt2>
-        <a:srgbClr val="FFFFFF"/>
+        <a:srgbClr val="ffffff"/>
       </a:lt2>
       <a:accent1>
-        <a:srgbClr val="18A303"/>
+        <a:srgbClr val="18a303"/>
       </a:accent1>
       <a:accent2>
-        <a:srgbClr val="0369A3"/>
+        <a:srgbClr val="0369a3"/>
       </a:accent2>
       <a:accent3>
-        <a:srgbClr val="A33E03"/>
+        <a:srgbClr val="a33e03"/>
       </a:accent3>
       <a:accent4>
-        <a:srgbClr val="8E03A3"/>
+        <a:srgbClr val="8e03a3"/>
       </a:accent4>
       <a:accent5>
-        <a:srgbClr val="C99C00"/>
+        <a:srgbClr val="c99c00"/>
       </a:accent5>
       <a:accent6>
-        <a:srgbClr val="C9211E"/>
+        <a:srgbClr val="c9211e"/>
       </a:accent6>
       <a:hlink>
-        <a:srgbClr val="0000EE"/>
+        <a:srgbClr val="0000ee"/>
       </a:hlink>
       <a:folHlink>
-        <a:srgbClr val="551A8B"/>
+        <a:srgbClr val="551a8b"/>
       </a:folHlink>
     </a:clrScheme>
     <a:fontScheme name="Office">

</xml_diff>